<commit_message>
Guardar el modelo entrenado
</commit_message>
<xml_diff>
--- a/Semana7.docx
+++ b/Semana7.docx
@@ -69,43 +69,61 @@
         <w:rPr>
           <w:b/>
         </w:rPr>
-        <w:t>I</w:t>
-      </w:r>
-      <w:r>
+        <w:t>Implementar entrenamiento inicial de la CNN</w:t>
+      </w:r>
+    </w:p>
+    <w:p>
+      <w:r>
+        <w:t>Se implementó el proceso de entrenamiento de la red neuronal convolucional utilizando los conjuntos de datos de entrenamiento y validación preparados previamente.</w:t>
+      </w:r>
+    </w:p>
+    <w:p>
+      <w:r>
+        <w:t>Se estableció la configuración inicial de las épocas de entrenamiento y se incorporó el seguimiento de las métricas de pérdida y precisión durante el aprendizaje.</w:t>
+      </w:r>
+    </w:p>
+    <w:p>
+      <w:r>
+        <w:t>Este avance permitirá observar cómo aprende el modelo a partir de las radiografías de tórax y obtener información para realizar ajustes posteriores.</w:t>
+      </w:r>
+    </w:p>
+    <w:p>
+      <w:bookmarkStart w:id="0" w:name="_GoBack"/>
+      <w:bookmarkEnd w:id="0"/>
+    </w:p>
+    <w:p>
+      <w:pPr>
         <w:rPr>
           <w:b/>
         </w:rPr>
-        <w:t>mplementar en</w:t>
-      </w:r>
+      </w:pPr>
       <w:r>
         <w:rPr>
           <w:b/>
         </w:rPr>
-        <w:t>trenamiento inicial de la CNN</w:t>
-      </w:r>
-    </w:p>
-    <w:p>
-      <w:r>
-        <w:t>Se implementó el proceso de entrenamiento de la red neuronal convolucional utilizando los conjuntos de datos de entrenamiento y val</w:t>
-      </w:r>
-      <w:r>
-        <w:t>idación preparados previamente.</w:t>
-      </w:r>
-    </w:p>
-    <w:p>
-      <w:r>
-        <w:t>Se estableció la configuración inicial de las épocas de entrenamiento y se incorporó el seguimiento de las métricas de pérdida y pr</w:t>
-      </w:r>
-      <w:r>
-        <w:t>ecisión durante el aprendizaje.</w:t>
-      </w:r>
-    </w:p>
-    <w:p>
-      <w:r>
-        <w:t>Este avance permitirá observar cómo aprende el modelo a partir de las radiografías de tórax y obtener información para realizar ajustes posteriores.</w:t>
-      </w:r>
-      <w:bookmarkStart w:id="0" w:name="_GoBack"/>
-      <w:bookmarkEnd w:id="0"/>
+        <w:t>Guardar modelo CNN entrenado</w:t>
+      </w:r>
+    </w:p>
+    <w:p>
+      <w:r>
+        <w:t>Se incorporó la funcionalidad para guardar el modelo de red neuronal convolucional después del entrenamiento, con el propósito de conservar la configuración aprendida y permitir su uti</w:t>
+      </w:r>
+      <w:r>
+        <w:t>lización en etapas posteriores.</w:t>
+      </w:r>
+    </w:p>
+    <w:p>
+      <w:r>
+        <w:t>También se estableció una ubicación para almacenar el modelo generado dentro</w:t>
+      </w:r>
+      <w:r>
+        <w:t xml:space="preserve"> de la estructura del proyecto.</w:t>
+      </w:r>
+    </w:p>
+    <w:p>
+      <w:r>
+        <w:t>Este avance permitirá reutilizar el modelo sin necesidad de repetir el entrenamiento cada vez y facilitará su posterior evaluación con imágenes de prueba.</w:t>
+      </w:r>
     </w:p>
     <w:sectPr>
       <w:pgSz w:w="12240" w:h="15840"/>

</xml_diff>